<commit_message>
feat: templates genéricos para loteamento e vertical por empreendimento
Belvedere template (loteamento):
- Remove todos os textos hardcoded (vendedora, CNPJ, empreendimento, comarca)
- Adiciona placeholders: {VENDEDORA_NOME}, {VENDEDORA_QUALIFICACAO}, {VENDEDORA_PIX},
  {EMP_NOME}, {CIDADE_ASSINATURA}
- Endpoint puxa esses dados do cadastro do empreendimento

Empreendimento cadastro:
- Nova seção "Dados para Contrato de Venda" no formulário com:
  comarca, matrícula, incorporação, vendedora nome, qualificação,
  prazo entrega, início obra, valor CUB
- POST e PUT de empreendimentos salvam todos os novos campos
- Dados preenchem automaticamente tanto o contrato de loteamento
  quanto o contrato vertical no momento da geração

Co-Authored-By: Claude Sonnet 4.6 <noreply@anthropic.com>
</commit_message>
<xml_diff>
--- a/templates/belvedere-compra-venda.docx
+++ b/templates/belvedere-compra-venda.docx
@@ -28,7 +28,7 @@
           <w:lang w:eastAsia="pt-BR"/>
           <w14:ligatures w14:val="none"/>
         </w:rPr>
-        <w:t>LOTEAMENTO “RESIDENCIAL BELVEDERE”</w:t>
+        <w:t>LOTEAMENTO “{EMP_NOME}”</w:t>
       </w:r>
       <w:r>
         <w:rPr>
@@ -90,7 +90,7 @@
           <w:lang w:eastAsia="pt-BR"/>
           <w14:ligatures w14:val="none"/>
         </w:rPr>
-        <w:t>LOTEAMENTO “RESIDENCIAL BELVEDERE”</w:t>
+        <w:t>LOTEAMENTO “{EMP_NOME}”</w:t>
       </w:r>
       <w:r>
         <w:rPr>
@@ -184,32 +184,18 @@
           <w:lang w:eastAsia="pt-BR"/>
           <w14:ligatures w14:val="none"/>
         </w:rPr>
-        <w:t>RESIDENCIAL BELVEDERE - SPE LTDA</w:t>
-      </w:r>
-      <w:r>
-        <w:rPr>
-          <w:rFonts w:ascii="Times New Roman" w:eastAsia="Times New Roman" w:hAnsi="Times New Roman" w:cs="Times New Roman"/>
-          <w:kern w:val="0"/>
-          <w:sz w:val="24"/>
-          <w:szCs w:val="24"/>
-          <w:lang w:eastAsia="pt-BR"/>
-          <w14:ligatures w14:val="none"/>
-        </w:rPr>
-        <w:t>, cadastrada sob o CNPJ n. 66.357.242/0001-45, com sede na Rua Joao Wessler, nº 520, Sala 102, Nossa Senhora Aparecida, São Ludgero SC, e-mail financeiro@sustentareengenharia.com, neste ato representado pelo seu administrador</w:t>
-      </w:r>
-      <w:r>
-        <w:t xml:space="preserve"> </w:t>
-      </w:r>
-      <w:r>
-        <w:rPr>
-          <w:rFonts w:ascii="Times New Roman" w:eastAsia="Times New Roman" w:hAnsi="Times New Roman" w:cs="Times New Roman"/>
-          <w:kern w:val="0"/>
-          <w:sz w:val="24"/>
-          <w:szCs w:val="24"/>
-          <w:lang w:eastAsia="pt-BR"/>
-          <w14:ligatures w14:val="none"/>
-        </w:rPr>
-        <w:t>MAIHCON MATIAS, brasileiro, nascido em 29/01/1992, casado sob o regime de comunhão parcial de bens, empresário, inscrito no CPF sob nº 069.250.679-92, portador da carteira de identidade nº 5.488.827, órgão expedidor SSP - SC, residente e domiciliado na Avenida Santos Dumont, nº 617, bairro Parque das Acácias, São Ludgero - SC, CEP 88.730-000</w:t>
+        <w:t>{VENDEDORA_NOME}</w:t>
+      </w:r>
+      <w:r>
+        <w:rPr>
+          <w:rFonts w:ascii="Times New Roman" w:eastAsia="Times New Roman" w:hAnsi="Times New Roman" w:cs="Times New Roman"/>
+          <w:kern w:val="0"/>
+          <w:sz w:val="24"/>
+          <w:szCs w:val="24"/>
+          <w:lang w:eastAsia="pt-BR"/>
+          <w14:ligatures w14:val="none"/>
+        </w:rPr>
+        <w:t>{VENDEDORA_QUALIFICACAO}</w:t>
       </w:r>
     </w:p>
     <w:p>
@@ -439,7 +425,7 @@
           <w:lang w:eastAsia="pt-BR"/>
           <w14:ligatures w14:val="none"/>
         </w:rPr>
-        <w:t>RESIDENCIAL BELVEDERE</w:t>
+        <w:t>{EMP_NOME}</w:t>
       </w:r>
       <w:r>
         <w:rPr>
@@ -855,7 +841,7 @@
           <w:lang w:eastAsia="pt-BR"/>
           <w14:ligatures w14:val="none"/>
         </w:rPr>
-        <w:t xml:space="preserve"> de titularidade do vendedor – Loteamento Residencial Belvedere </w:t>
+        <w:t xml:space="preserve"> de titularidade do vendedor – {EMP_NOME} </w:t>
       </w:r>
       <w:r>
         <w:rPr>
@@ -892,7 +878,7 @@
           <w:lang w:eastAsia="pt-BR"/>
           <w14:ligatures w14:val="none"/>
         </w:rPr>
-        <w:t>PIX CNPJ 66.357.242/0001-45</w:t>
+        <w:t>{VENDEDORA_PIX}</w:t>
       </w:r>
       <w:r>
         <w:rPr>
@@ -1165,7 +1151,7 @@
           <w:lang w:eastAsia="pt-BR"/>
           <w14:ligatures w14:val="none"/>
         </w:rPr>
-        <w:t>“RESIDENCIAL BELVEDERE”</w:t>
+        <w:t>“{EMP_NOME}”</w:t>
       </w:r>
       <w:r>
         <w:rPr>
@@ -1227,7 +1213,7 @@
           <w:lang w:eastAsia="pt-BR"/>
           <w14:ligatures w14:val="none"/>
         </w:rPr>
-        <w:t xml:space="preserve"> LOTEAMENTO “RESIDENCIAL BELVEDERE”</w:t>
+        <w:t xml:space="preserve"> LOTEAMENTO “{EMP_NOME}”</w:t>
       </w:r>
       <w:r>
         <w:rPr>
@@ -1364,7 +1350,7 @@
           <w:lang w:eastAsia="pt-BR"/>
           <w14:ligatures w14:val="none"/>
         </w:rPr>
-        <w:t>LOTEAMENTO “RESIDENCIAL BELVEDERE”</w:t>
+        <w:t>LOTEAMENTO “{EMP_NOME}”</w:t>
       </w:r>
       <w:r>
         <w:rPr>
@@ -1643,7 +1629,7 @@
                 <w:lang w:eastAsia="pt-BR"/>
                 <w14:ligatures w14:val="none"/>
               </w:rPr>
-              <w:t xml:space="preserve"> de titularidade do vendedor – Loteamento Residencial Belvedere </w:t>
+              <w:t xml:space="preserve"> de titularidade do vendedor – {EMP_NOME} </w:t>
             </w:r>
             <w:r>
               <w:rPr>
@@ -1680,7 +1666,7 @@
                 <w:lang w:eastAsia="pt-BR"/>
                 <w14:ligatures w14:val="none"/>
               </w:rPr>
-              <w:t>PIX CNPJ 66.357.242/0001-45</w:t>
+              <w:t>{VENDEDORA_PIX}</w:t>
             </w:r>
             <w:r>
               <w:rPr>
@@ -1823,7 +1809,7 @@
                 <w:lang w:eastAsia="pt-BR"/>
                 <w14:ligatures w14:val="none"/>
               </w:rPr>
-              <w:t xml:space="preserve"> de titularidade do vendedor – Loteamento Residencial Belvedere </w:t>
+              <w:t xml:space="preserve"> de titularidade do vendedor – {EMP_NOME} </w:t>
             </w:r>
             <w:r>
               <w:rPr>
@@ -1860,7 +1846,7 @@
                 <w:lang w:eastAsia="pt-BR"/>
                 <w14:ligatures w14:val="none"/>
               </w:rPr>
-              <w:t>PIX CNPJ 66.357.242/0001-45</w:t>
+              <w:t>{VENDEDORA_PIX}</w:t>
             </w:r>
             <w:r>
               <w:rPr>
@@ -1981,7 +1967,7 @@
                 <w:lang w:eastAsia="pt-BR"/>
                 <w14:ligatures w14:val="none"/>
               </w:rPr>
-              <w:t xml:space="preserve"> de titularidade do vendedor – Loteamento Residencial Belvedere </w:t>
+              <w:t xml:space="preserve"> de titularidade do vendedor – {EMP_NOME} </w:t>
             </w:r>
             <w:r>
               <w:rPr>
@@ -2018,7 +2004,7 @@
                 <w:lang w:eastAsia="pt-BR"/>
                 <w14:ligatures w14:val="none"/>
               </w:rPr>
-              <w:t>PIX CNPJ 66.357.242/0001-45</w:t>
+              <w:t>{VENDEDORA_PIX}</w:t>
             </w:r>
             <w:r>
               <w:rPr>
@@ -4693,7 +4679,7 @@
           <w:lang w:eastAsia="pt-BR"/>
           <w14:ligatures w14:val="none"/>
         </w:rPr>
-        <w:t>Braço do Norte/SC</w:t>
+        <w:t>{CIDADE_ASSINATURA}</w:t>
       </w:r>
       <w:r>
         <w:rPr>
@@ -4892,7 +4878,7 @@
           <w:lang w:eastAsia="pt-BR"/>
           <w14:ligatures w14:val="none"/>
         </w:rPr>
-        <w:t>RESIDENCIAL BELVEDERE</w:t>
+        <w:t>{EMP_NOME}</w:t>
       </w:r>
     </w:p>
     <w:p>

</xml_diff>